<commit_message>
feat: regenerate docx files with proper EDS formatting
- Nav uses proper bulleted list with indentation for sub-items
- All links use full absolute URLs (no relative paths)
- Hero block table has image in correct cell
- Section dividers use thematic breaks
- Single generator script: tools/create-all-docx.js
</commit_message>
<xml_diff>
--- a/content/footer.docx
+++ b/content/footer.docx
@@ -15,8 +15,12 @@
       <w:r>
         <w:t xml:space="preserve">Copyright © 2026 Australia Post. All Rights Reserved. Our </w:t>
       </w:r>
-      <w:hyperlink w:history="1" r:id="rIdwvn7pmetk8lefip5_tac2">
+      <w:hyperlink w:history="1" r:id="rId0gf1igsqx2bzdnxgpui2q">
         <w:r>
+          <w:rPr>
+            <w:b w:val="false"/>
+            <w:bCs w:val="false"/>
+          </w:rPr>
           <w:t xml:space="preserve">privacy policy</w:t>
         </w:r>
       </w:hyperlink>

</xml_diff>